<commit_message>
Rewrite report in plainer desu-masu style
Co-Authored-By: Claude Fable 5 <noreply@anthropic.com>
Claude-Session: https://claude.ai/code/session_01DpTFQMrCJE7j72XeUMnPZi
</commit_message>
<xml_diff>
--- a/reports/PE講義レポート.docx
+++ b/reports/PE講義レポート.docx
@@ -27,85 +27,85 @@
           <w:sz w:val="21"/>
           <w:szCs w:val="21"/>
         </w:rPr>
-        <w:t xml:space="preserve">私は現在、事業会社からハンズオン支援を看板に掲げるPEファンドに出向している。日々の業務で見聞きしていることが講義でどう語られるのか、半ば答え合わせのような気持ちで受講したが、実務の肌感覚と講義の内容が重なる場面が多く、自分の仕事を一段引いた視点から捉え直す機会になった。以下、特に有意義だった点を自由に述べたい。</w:t>
-      </w:r>
-    </w:p>
-    <w:p>
-      <w:pPr>
-        <w:spacing w:after="200" w:line="360"/>
-        <w:ind w:firstLine="210"/>
-      </w:pPr>
-      <w:r>
-        <w:rPr>
-          <w:sz w:val="21"/>
-          <w:szCs w:val="21"/>
-        </w:rPr>
-        <w:t xml:space="preserve">まず挙げたいのは、初回の講義で語られた「金融と言いながら、実は事業が本質的なテーマ」という指摘である。安く買い、レバレッジをかけ、高く売るという金融工学的な手法の効果はもはや限定的で、EBITDA、すなわち本源的な収益力を引き上げ、商品・サービスの競争力を高めない限りリターンは出ない。頭では分かっていたつもりだが、ジャパンブルーの事例でこれが具体に落ちた。投資判断の決め手が、デューデリジェンスの技術論ではなく、縫製工場の75歳の工場長が語る「職人が執着すべきクオリティ」の映像だったという話は印象的だった。財務諸表に表れない価値の源泉を見て「完全なアンダーバリューだ」と確信する。バリュエーションの数式の手前に、事業と人を見る目があるのだと再認識した。</w:t>
-      </w:r>
-    </w:p>
-    <w:p>
-      <w:pPr>
-        <w:spacing w:after="200" w:line="360"/>
-        <w:ind w:firstLine="210"/>
-      </w:pPr>
-      <w:r>
-        <w:rPr>
-          <w:sz w:val="21"/>
-          <w:szCs w:val="21"/>
-        </w:rPr>
-        <w:t xml:space="preserve">次に、最も共感したのは従業員エンゲージメントをめぐる議論である。講義では、エンゲージメントが低くなるのは業績が良いか悪いかではなく、「従業員の声が経営層に届いていない」「自分たちが軽視されている」といったことに強く影響される、だからこそ声を聞ける場を作り、それを経営に反映していくことが重要だ、という趣旨の話があった。これは出向先での実感と完全に一致する。投資先の現場で従業員の方と話していると、不満の中身は待遇そのものより「決定のプロセスから外されている」ことへの寂しさであることが多い。投資直後の3か月をかけて100人全員とワンオンワンを行い、誰がどんな能力と意欲を持っているかを把握してから初めて基本戦略を立てるという講師の順序は、遠回りに見えて実は最短距離なのだと思う。ストックオプションやRSといった制度は出向先でも活用しているが、制度と対話は代替関係ではなく両輪であり、「ありがとう、一緒に頑張ろう」と熱量を持って一人ひとりに伝える泥臭い部分こそが制度を機能させるという整理は、そのまま自分の業務に持ち帰りたい。</w:t>
-      </w:r>
-    </w:p>
-    <w:p>
-      <w:pPr>
-        <w:spacing w:after="200" w:line="360"/>
-        <w:ind w:firstLine="210"/>
-      </w:pPr>
-      <w:r>
-        <w:rPr>
-          <w:sz w:val="21"/>
-          <w:szCs w:val="21"/>
-        </w:rPr>
-        <w:t xml:space="preserve">一方で耳が痛かったのは、事業運営の担当者は出向者としてではなく「あくまで当事者として対象先のメンバーと同じ釜の飯を食う」というくだりである。出向という立場にある自分は、無意識のうちに「いずれ帰る人間」として振る舞っていないか。当事者性は所属形態ではなく覚悟の問題だと解釈したが、この問いは在籍中ずっと持ち続けたい。</w:t>
-      </w:r>
-    </w:p>
-    <w:p>
-      <w:pPr>
-        <w:spacing w:after="200" w:line="360"/>
-        <w:ind w:firstLine="210"/>
-      </w:pPr>
-      <w:r>
-        <w:rPr>
-          <w:sz w:val="21"/>
-          <w:szCs w:val="21"/>
-        </w:rPr>
-        <w:t xml:space="preserve">投資実務のプロセスを一つずつ辿った回では、業界の華やかなイメージとの落差そのものが勉強になった。17か月で約1,000件の案件情報に触れながらLOI提出はわずか8件、DD実施はゼロ。「千三つ」が誇張ではないという数字には正直驚いた。ソーシングは要するに営業であり、「案件を取ってくるやつが一番偉い」という言葉には、書籍などで語られがちなキラキラした業界像を剥がす率直さがあった。DDが「魔物」であるという話も面白かった。株主の変遷が書類でも記憶でも辿れない、賃貸借契約のCOC条項一つでディールが白紙になる、クロージング直前に売主の心変わりが起きる。非上場の中小企業を扱う難しさについて解像度が大きく上がった。加えて、1億円近いDDコストを投じた後に「これはやってはいかん」と撤退を判断できるかというサンクコストの議論は、投資に限らずあらゆる意思決定に通じる普遍的な論点だと感じた。</w:t>
-      </w:r>
-    </w:p>
-    <w:p>
-      <w:pPr>
-        <w:spacing w:after="200" w:line="360"/>
-        <w:ind w:firstLine="210"/>
-      </w:pPr>
-      <w:r>
-        <w:rPr>
-          <w:sz w:val="21"/>
-          <w:szCs w:val="21"/>
-        </w:rPr>
-        <w:t xml:space="preserve">スキーム面では、売主再出資による2段階エグジットの説明が腹落ちした。12億円での売り切りよりも、10億円に譲歩してもらい1億円を再出資してもらう方が、レバレッジ効果により売主は20%の持分を確保でき、再エグジット時の手取り総額はむしろ大きくなり得る。ただしこの設計が成立するかどうかは、数年後の企業価値の絵姿を売主に信じてもらえるか、つまり投資ストーリーの蓋然性と語り手への信頼にかかっている。結局ここでも、テクニカルな設計の巧拙以上に「誠実であること」「フェアネス」という一見素朴な価値観が競争力の源泉になっているのが興味深い。駆け引きをせず、耳ざわりの良くないことも先にさらけ出すという姿勢は、条件交渉で消耗しがちな自分の日常業務への処方箋でもあった。</w:t>
-      </w:r>
-    </w:p>
-    <w:p>
-      <w:pPr>
-        <w:spacing w:after="200" w:line="360"/>
-        <w:ind w:firstLine="210"/>
-      </w:pPr>
-      <w:r>
-        <w:rPr>
-          <w:sz w:val="21"/>
-          <w:szCs w:val="21"/>
-        </w:rPr>
-        <w:t xml:space="preserve">総じて本講義の意義は、PEという仕事を金融技術としてではなく経営そのもの、さらに言えば生き方の問題として提示した点にあると思う。判断の上位概念に「美意識」を置き、投資家・社員・取引先・ユーザーというステークホルダー全員が幸せになることを本気で考えない投資は失敗するという教訓は、精神論ではなく、労務トラブルゼロや投資元本を一度も割っていないという実績と表裏一体で語られるからこそ重みがある。出向者として中途半端になりがちな自分の立ち位置を見つめ直し、投資先に当事者として臨むこと。それが本講義から受け取った一番大きな宿題である。講義で得た視点を明日からの出向先での業務にそのまま持ち込み、実践のなかで検証していきたい。</w:t>
+        <w:t xml:space="preserve">私は現在、事業会社からPEファンドに出向しています。出向先はハンズオン支援に力を入れているファンドなので、講義の内容は自分の業務と重なる部分が多く、共感しながら聞くことができました。以下、有意義だった点、勉強になった点について書きます。</w:t>
+      </w:r>
+    </w:p>
+    <w:p>
+      <w:pPr>
+        <w:spacing w:after="200" w:line="360"/>
+        <w:ind w:firstLine="210"/>
+      </w:pPr>
+      <w:r>
+        <w:rPr>
+          <w:sz w:val="21"/>
+          <w:szCs w:val="21"/>
+        </w:rPr>
+        <w:t xml:space="preserve">まず、「金融と言いながら、実は事業が本質」という話が印象に残りました。安く買ってレバレッジをかけて高く売るという金融工学的な手法は今では効果が限定的で、EBITDA、つまり本業の収益力を上げて、商品やサービスの競争力を高めないとリターンは出ないという説明でした。このことは自分も日々の業務で感じていましたが、ジャパンブルーの事例を聞いて理解が深まりました。特に、投資判断の決め手が、デューデリジェンスの分析ではなく、縫製工場の75歳の工場長が「職人が執着すべきクオリティ」について語る映像だったという話が印象的でした。財務諸表に出てこない価値を見て「完全なアンダーバリューだ」と確信したという部分に、数字の手前でまず事業と人を見ることの大切さを感じました。</w:t>
+      </w:r>
+    </w:p>
+    <w:p>
+      <w:pPr>
+        <w:spacing w:after="200" w:line="360"/>
+        <w:ind w:firstLine="210"/>
+      </w:pPr>
+      <w:r>
+        <w:rPr>
+          <w:sz w:val="21"/>
+          <w:szCs w:val="21"/>
+        </w:rPr>
+        <w:t xml:space="preserve">次に、一番共感したのはエンゲージメントについての話です。講義の中で、エンゲージメントが低くなるのは業績が良いか悪いかではなく、「従業員の声が経営層に届いていない」「自分たちが軽視されている」といったことに強く影響される、だからこそ声を聞ける場を作り、経営に反映していくことが重要だ、という趣旨の話がありました。これは出向先で私が感じていることとまったく同じです。投資先の従業員の方と話をすると、不満の中身は待遇そのものよりも、自分たちに何も知らされないまま物事が決まっていくことへの不満であることが多いです。講師が投資直後の3か月で100人全員とワンオンワンを行い、それから基本戦略を立てるという話は、遠回りに見えて、実際には一番確実なやり方なのだろうと思いました。ストックオプションなどの制度は出向先でも使っていますが、制度だけでは人は動かず、一人ひとりとの対話とセットになって初めて機能するという点は、自分の業務でも意識していきたいと思います。</w:t>
+      </w:r>
+    </w:p>
+    <w:p>
+      <w:pPr>
+        <w:spacing w:after="200" w:line="360"/>
+        <w:ind w:firstLine="210"/>
+      </w:pPr>
+      <w:r>
+        <w:rPr>
+          <w:sz w:val="21"/>
+          <w:szCs w:val="21"/>
+        </w:rPr>
+        <w:t xml:space="preserve">また、事業運営の担当者は出向者としてではなく「当事者として対象先のメンバーと同じ釜の飯を食う」という話は、出向の立場である自分にとって耳の痛い話でした。自分はどこかで「いずれ戻る人間」という意識で仕事をしていないか、考えさせられました。</w:t>
+      </w:r>
+    </w:p>
+    <w:p>
+      <w:pPr>
+        <w:spacing w:after="200" w:line="360"/>
+        <w:ind w:firstLine="210"/>
+      </w:pPr>
+      <w:r>
+        <w:rPr>
+          <w:sz w:val="21"/>
+          <w:szCs w:val="21"/>
+        </w:rPr>
+        <w:t xml:space="preserve">投資実務の回では、業界の華やかなイメージとの差が勉強になりました。17か月で約1,000件の案件情報を見て、LOIを提出したのは8件、DDまで進んだのはゼロという数字には驚きました。「千三つ」という言葉が誇張ではないことがよく分かりました。「案件を取ってくるやつが一番偉い」、つまりソーシングは要するに営業だという説明も、本などで読むPE業界のイメージとは違う、現場の実感がこもった話だと感じました。DDについても、株主の変遷が書類でも記憶でも辿れない、賃貸借契約のCOC条項でディールが白紙になる、クロージング直前に売主の気が変わる、といった具体例が多く、非上場の中小企業を対象にすることの難しさがよく理解できました。DDに1億円近くかけた後でも「これはやってはいけない」と判断して降りられるかどうかというサンクコストの話は、投資に限らずどんな仕事にも当てはまると思いました。</w:t>
+      </w:r>
+    </w:p>
+    <w:p>
+      <w:pPr>
+        <w:spacing w:after="200" w:line="360"/>
+        <w:ind w:firstLine="210"/>
+      </w:pPr>
+      <w:r>
+        <w:rPr>
+          <w:sz w:val="21"/>
+          <w:szCs w:val="21"/>
+        </w:rPr>
+        <w:t xml:space="preserve">スキームの説明では、売主再出資による2段階エグジットが勉強になりました。12億円で売り切るよりも、10億円に下げてもらって1億円を再出資してもらう方が、レバレッジの効果で売主は20%の持分を持つことができ、再エグジットの時には合計の手取りが大きくなる可能性があるという説明は分かりやすかったです。ただ、このスキームが成立するかどうかは、数年後の企業価値を売主に信じてもらえるかどうかにかかっていて、最終的には投資ストーリーと人への信頼の問題になるという点が印象に残りました。駆け引きをせず、都合の悪いことも先に伝えるという「誠実さ」の話も、自分の業務で参考にしたいと思います。</w:t>
+      </w:r>
+    </w:p>
+    <w:p>
+      <w:pPr>
+        <w:spacing w:after="200" w:line="360"/>
+        <w:ind w:firstLine="210"/>
+      </w:pPr>
+      <w:r>
+        <w:rPr>
+          <w:sz w:val="21"/>
+          <w:szCs w:val="21"/>
+        </w:rPr>
+        <w:t xml:space="preserve">全体を通じて、PEの仕事を金融の技術としてではなく、経営そのものとして説明していただいた点に本講義の意義があったと思います。ステークホルダー全員が幸せになることを本気で考えないと投資は失敗するという話が、労務トラブルゼロ、投資元本を割ったことがないという実績とセットで語られていた点に説得力がありました。出向者という中途半端になりがちな立場ではありますが、講義で学んだことを踏まえて、投資先に対して当事者意識を持って業務にあたりたいと思います。</w:t>
       </w:r>
     </w:p>
     <w:sectPr>

</xml_diff>

<commit_message>
Rewrite report in da/dearu professional tone
Co-Authored-By: Claude Fable 5 <noreply@anthropic.com>
Claude-Session: https://claude.ai/code/session_01DpTFQMrCJE7j72XeUMnPZi
</commit_message>
<xml_diff>
--- a/reports/PE講義レポート.docx
+++ b/reports/PE講義レポート.docx
@@ -27,85 +27,85 @@
           <w:sz w:val="21"/>
           <w:szCs w:val="21"/>
         </w:rPr>
-        <w:t xml:space="preserve">私は現在、事業会社からPEファンドに出向しています。出向先はハンズオン支援に力を入れているファンドなので、講義の内容は自分の業務と重なる部分が多く、共感しながら聞くことができました。以下、有意義だった点、勉強になった点について書きます。</w:t>
-      </w:r>
-    </w:p>
-    <w:p>
-      <w:pPr>
-        <w:spacing w:after="200" w:line="360"/>
-        <w:ind w:firstLine="210"/>
-      </w:pPr>
-      <w:r>
-        <w:rPr>
-          <w:sz w:val="21"/>
-          <w:szCs w:val="21"/>
-        </w:rPr>
-        <w:t xml:space="preserve">まず、「金融と言いながら、実は事業が本質」という話が印象に残りました。安く買ってレバレッジをかけて高く売るという金融工学的な手法は今では効果が限定的で、EBITDA、つまり本業の収益力を上げて、商品やサービスの競争力を高めないとリターンは出ないという説明でした。このことは自分も日々の業務で感じていましたが、ジャパンブルーの事例を聞いて理解が深まりました。特に、投資判断の決め手が、デューデリジェンスの分析ではなく、縫製工場の75歳の工場長が「職人が執着すべきクオリティ」について語る映像だったという話が印象的でした。財務諸表に出てこない価値を見て「完全なアンダーバリューだ」と確信したという部分に、数字の手前でまず事業と人を見ることの大切さを感じました。</w:t>
-      </w:r>
-    </w:p>
-    <w:p>
-      <w:pPr>
-        <w:spacing w:after="200" w:line="360"/>
-        <w:ind w:firstLine="210"/>
-      </w:pPr>
-      <w:r>
-        <w:rPr>
-          <w:sz w:val="21"/>
-          <w:szCs w:val="21"/>
-        </w:rPr>
-        <w:t xml:space="preserve">次に、一番共感したのはエンゲージメントについての話です。講義の中で、エンゲージメントが低くなるのは業績が良いか悪いかではなく、「従業員の声が経営層に届いていない」「自分たちが軽視されている」といったことに強く影響される、だからこそ声を聞ける場を作り、経営に反映していくことが重要だ、という趣旨の話がありました。これは出向先で私が感じていることとまったく同じです。投資先の従業員の方と話をすると、不満の中身は待遇そのものよりも、自分たちに何も知らされないまま物事が決まっていくことへの不満であることが多いです。講師が投資直後の3か月で100人全員とワンオンワンを行い、それから基本戦略を立てるという話は、遠回りに見えて、実際には一番確実なやり方なのだろうと思いました。ストックオプションなどの制度は出向先でも使っていますが、制度だけでは人は動かず、一人ひとりとの対話とセットになって初めて機能するという点は、自分の業務でも意識していきたいと思います。</w:t>
-      </w:r>
-    </w:p>
-    <w:p>
-      <w:pPr>
-        <w:spacing w:after="200" w:line="360"/>
-        <w:ind w:firstLine="210"/>
-      </w:pPr>
-      <w:r>
-        <w:rPr>
-          <w:sz w:val="21"/>
-          <w:szCs w:val="21"/>
-        </w:rPr>
-        <w:t xml:space="preserve">また、事業運営の担当者は出向者としてではなく「当事者として対象先のメンバーと同じ釜の飯を食う」という話は、出向の立場である自分にとって耳の痛い話でした。自分はどこかで「いずれ戻る人間」という意識で仕事をしていないか、考えさせられました。</w:t>
-      </w:r>
-    </w:p>
-    <w:p>
-      <w:pPr>
-        <w:spacing w:after="200" w:line="360"/>
-        <w:ind w:firstLine="210"/>
-      </w:pPr>
-      <w:r>
-        <w:rPr>
-          <w:sz w:val="21"/>
-          <w:szCs w:val="21"/>
-        </w:rPr>
-        <w:t xml:space="preserve">投資実務の回では、業界の華やかなイメージとの差が勉強になりました。17か月で約1,000件の案件情報を見て、LOIを提出したのは8件、DDまで進んだのはゼロという数字には驚きました。「千三つ」という言葉が誇張ではないことがよく分かりました。「案件を取ってくるやつが一番偉い」、つまりソーシングは要するに営業だという説明も、本などで読むPE業界のイメージとは違う、現場の実感がこもった話だと感じました。DDについても、株主の変遷が書類でも記憶でも辿れない、賃貸借契約のCOC条項でディールが白紙になる、クロージング直前に売主の気が変わる、といった具体例が多く、非上場の中小企業を対象にすることの難しさがよく理解できました。DDに1億円近くかけた後でも「これはやってはいけない」と判断して降りられるかどうかというサンクコストの話は、投資に限らずどんな仕事にも当てはまると思いました。</w:t>
-      </w:r>
-    </w:p>
-    <w:p>
-      <w:pPr>
-        <w:spacing w:after="200" w:line="360"/>
-        <w:ind w:firstLine="210"/>
-      </w:pPr>
-      <w:r>
-        <w:rPr>
-          <w:sz w:val="21"/>
-          <w:szCs w:val="21"/>
-        </w:rPr>
-        <w:t xml:space="preserve">スキームの説明では、売主再出資による2段階エグジットが勉強になりました。12億円で売り切るよりも、10億円に下げてもらって1億円を再出資してもらう方が、レバレッジの効果で売主は20%の持分を持つことができ、再エグジットの時には合計の手取りが大きくなる可能性があるという説明は分かりやすかったです。ただ、このスキームが成立するかどうかは、数年後の企業価値を売主に信じてもらえるかどうかにかかっていて、最終的には投資ストーリーと人への信頼の問題になるという点が印象に残りました。駆け引きをせず、都合の悪いことも先に伝えるという「誠実さ」の話も、自分の業務で参考にしたいと思います。</w:t>
-      </w:r>
-    </w:p>
-    <w:p>
-      <w:pPr>
-        <w:spacing w:after="200" w:line="360"/>
-        <w:ind w:firstLine="210"/>
-      </w:pPr>
-      <w:r>
-        <w:rPr>
-          <w:sz w:val="21"/>
-          <w:szCs w:val="21"/>
-        </w:rPr>
-        <w:t xml:space="preserve">全体を通じて、PEの仕事を金融の技術としてではなく、経営そのものとして説明していただいた点に本講義の意義があったと思います。ステークホルダー全員が幸せになることを本気で考えないと投資は失敗するという話が、労務トラブルゼロ、投資元本を割ったことがないという実績とセットで語られていた点に説得力がありました。出向者という中途半端になりがちな立場ではありますが、講義で学んだことを踏まえて、投資先に対して当事者意識を持って業務にあたりたいと思います。</w:t>
+        <w:t xml:space="preserve">私は現在、事業会社からPEファンドに出向している。出向先はハンズオン支援に力を入れているファンドであり、講義の内容は自身の業務と重なる部分が多く、共感を持って聞くことができた。以下、有意義だった点、勉強になった点について述べる。</w:t>
+      </w:r>
+    </w:p>
+    <w:p>
+      <w:pPr>
+        <w:spacing w:after="200" w:line="360"/>
+        <w:ind w:firstLine="210"/>
+      </w:pPr>
+      <w:r>
+        <w:rPr>
+          <w:sz w:val="21"/>
+          <w:szCs w:val="21"/>
+        </w:rPr>
+        <w:t xml:space="preserve">まず、「金融と言いながら、実は事業が本質」という指摘が印象に残った。安く買ってレバレッジをかけて高く売るという金融工学的な手法は今日では効果が限定的であり、EBITDA、すなわち本業の収益力を高め、商品やサービスの競争力を強化しなければリターンは出ないという説明であった。この点は自分自身も日々の業務で感じていたことだが、ジャパンブルーの事例を通じて理解が深まった。特に、投資判断の決め手がデューデリジェンスの分析ではなく、縫製工場の75歳の工場長が「職人が執着すべきクオリティ」について語る映像であったという話は印象的だった。財務諸表に表れない価値を見て「完全なアンダーバリューだ」と確信したという部分に、数字の前にまず事業と人を見ることの重要性を感じた。</w:t>
+      </w:r>
+    </w:p>
+    <w:p>
+      <w:pPr>
+        <w:spacing w:after="200" w:line="360"/>
+        <w:ind w:firstLine="210"/>
+      </w:pPr>
+      <w:r>
+        <w:rPr>
+          <w:sz w:val="21"/>
+          <w:szCs w:val="21"/>
+        </w:rPr>
+        <w:t xml:space="preserve">次に、最も共感したのはエンゲージメントに関する議論である。講義の中で、エンゲージメントが低下するのは業績の良し悪しによるものではなく、「従業員の声が経営層に届いていない」「自分たちが軽視されている」といった感覚に強く影響される、だからこそ声を聞ける場を作り、経営に反映していくことが重要である、という趣旨の話があった。これは出向先で私が日々感じていることと完全に一致する。投資先の従業員と話をすると、不満の中身は待遇そのものよりも、自分たちに知らされないまま物事が決まっていくことに対するものであることが多い。講師が投資直後の3か月で100人全員とワンオンワンを実施し、その上で基本戦略を立てるというやり方は、一見遠回りだが、実際には最も確実な方法だと思う。ストックオプション等の制度は出向先でも活用しているが、制度だけでは人は動かず、一人ひとりとの対話と組み合わせて初めて機能するという点は、自身の業務においても意識していきたい。</w:t>
+      </w:r>
+    </w:p>
+    <w:p>
+      <w:pPr>
+        <w:spacing w:after="200" w:line="360"/>
+        <w:ind w:firstLine="210"/>
+      </w:pPr>
+      <w:r>
+        <w:rPr>
+          <w:sz w:val="21"/>
+          <w:szCs w:val="21"/>
+        </w:rPr>
+        <w:t xml:space="preserve">また、事業運営の担当者は出向者としてではなく「当事者として対象先のメンバーと同じ釜の飯を食う」という話は、出向の立場にある自分にとって耳の痛いものだった。どこかで「いずれ戻る人間」という意識で仕事をしていないか、考えさせられた。</w:t>
+      </w:r>
+    </w:p>
+    <w:p>
+      <w:pPr>
+        <w:spacing w:after="200" w:line="360"/>
+        <w:ind w:firstLine="210"/>
+      </w:pPr>
+      <w:r>
+        <w:rPr>
+          <w:sz w:val="21"/>
+          <w:szCs w:val="21"/>
+        </w:rPr>
+        <w:t xml:space="preserve">投資実務の回では、業界の華やかなイメージとの落差が勉強になった。17か月で約1,000件の案件情報を検討し、LOIを提出したのは8件、DDまで進んだ案件はゼロという数字には驚いた。「千三つ」という言葉が誇張ではないことがよく分かった。「案件を取ってくるやつが一番偉い」、すなわちソーシングは本質的に営業であるという説明も、書籍等で語られるPE業界のイメージとは異なる、現場の実感がこもった話だと感じた。DDについても、株主の変遷が書類でも記憶でも辿れない、賃貸借契約のCOC条項によりディールが白紙になる、クロージング直前に売主の心変わりが起きる、といった具体例が豊富で、非上場の中小企業を対象とすることの難しさがよく理解できた。DDに1億円近くを投じた後であっても「これはやってはいけない」と判断して撤退できるかどうかというサンクコストの議論は、投資に限らずあらゆる業務に当てはまるものだと思う。</w:t>
+      </w:r>
+    </w:p>
+    <w:p>
+      <w:pPr>
+        <w:spacing w:after="200" w:line="360"/>
+        <w:ind w:firstLine="210"/>
+      </w:pPr>
+      <w:r>
+        <w:rPr>
+          <w:sz w:val="21"/>
+          <w:szCs w:val="21"/>
+        </w:rPr>
+        <w:t xml:space="preserve">スキームの説明では、売主再出資による2段階エグジットが勉強になった。12億円で売り切るよりも、10億円に下げてもらい1億円を再出資してもらう方が、レバレッジの効果により売主は20%の持分を確保でき、再エグジット時には手取りの合計が大きくなる可能性があるという説明は分かりやすかった。ただし、このスキームが成立するかどうかは、数年後の企業価値を売主に信じてもらえるかどうかにかかっており、最終的には投資ストーリーと人への信頼の問題に帰着するという点が印象に残った。駆け引きをせず、都合の悪いことも先に伝えるという「誠実さ」についての話も、自身の業務の参考にしたい。</w:t>
+      </w:r>
+    </w:p>
+    <w:p>
+      <w:pPr>
+        <w:spacing w:after="200" w:line="360"/>
+        <w:ind w:firstLine="210"/>
+      </w:pPr>
+      <w:r>
+        <w:rPr>
+          <w:sz w:val="21"/>
+          <w:szCs w:val="21"/>
+        </w:rPr>
+        <w:t xml:space="preserve">全体を通じて、PEの仕事を金融の技術としてではなく経営そのものとして説明された点に、本講義の意義があったと考える。ステークホルダー全員が幸せになることを本気で考えなければ投資は失敗するという話が、労務トラブルゼロ、投資元本を一度も割っていないという実績とともに語られていた点に説得力があった。出向者という中途半端になりがちな立場ではあるが、講義で学んだことを踏まえ、投資先に対して当事者意識を持って業務にあたりたい。</w:t>
       </w:r>
     </w:p>
     <w:sectPr>

</xml_diff>

<commit_message>
Adjust report style for more natural human variance
Co-Authored-By: Claude Fable 5 <noreply@anthropic.com>
Claude-Session: https://claude.ai/code/session_01DpTFQMrCJE7j72XeUMnPZi
</commit_message>
<xml_diff>
--- a/reports/PE講義レポート.docx
+++ b/reports/PE講義レポート.docx
@@ -27,85 +27,85 @@
           <w:sz w:val="21"/>
           <w:szCs w:val="21"/>
         </w:rPr>
-        <w:t xml:space="preserve">私は現在、事業会社からPEファンドに出向している。出向先はハンズオン支援に力を入れているファンドであり、講義の内容は自身の業務と重なる部分が多く、共感を持って聞くことができた。以下、有意義だった点、勉強になった点について述べる。</w:t>
-      </w:r>
-    </w:p>
-    <w:p>
-      <w:pPr>
-        <w:spacing w:after="200" w:line="360"/>
-        <w:ind w:firstLine="210"/>
-      </w:pPr>
-      <w:r>
-        <w:rPr>
-          <w:sz w:val="21"/>
-          <w:szCs w:val="21"/>
-        </w:rPr>
-        <w:t xml:space="preserve">まず、「金融と言いながら、実は事業が本質」という指摘が印象に残った。安く買ってレバレッジをかけて高く売るという金融工学的な手法は今日では効果が限定的であり、EBITDA、すなわち本業の収益力を高め、商品やサービスの競争力を強化しなければリターンは出ないという説明であった。この点は自分自身も日々の業務で感じていたことだが、ジャパンブルーの事例を通じて理解が深まった。特に、投資判断の決め手がデューデリジェンスの分析ではなく、縫製工場の75歳の工場長が「職人が執着すべきクオリティ」について語る映像であったという話は印象的だった。財務諸表に表れない価値を見て「完全なアンダーバリューだ」と確信したという部分に、数字の前にまず事業と人を見ることの重要性を感じた。</w:t>
-      </w:r>
-    </w:p>
-    <w:p>
-      <w:pPr>
-        <w:spacing w:after="200" w:line="360"/>
-        <w:ind w:firstLine="210"/>
-      </w:pPr>
-      <w:r>
-        <w:rPr>
-          <w:sz w:val="21"/>
-          <w:szCs w:val="21"/>
-        </w:rPr>
-        <w:t xml:space="preserve">次に、最も共感したのはエンゲージメントに関する議論である。講義の中で、エンゲージメントが低下するのは業績の良し悪しによるものではなく、「従業員の声が経営層に届いていない」「自分たちが軽視されている」といった感覚に強く影響される、だからこそ声を聞ける場を作り、経営に反映していくことが重要である、という趣旨の話があった。これは出向先で私が日々感じていることと完全に一致する。投資先の従業員と話をすると、不満の中身は待遇そのものよりも、自分たちに知らされないまま物事が決まっていくことに対するものであることが多い。講師が投資直後の3か月で100人全員とワンオンワンを実施し、その上で基本戦略を立てるというやり方は、一見遠回りだが、実際には最も確実な方法だと思う。ストックオプション等の制度は出向先でも活用しているが、制度だけでは人は動かず、一人ひとりとの対話と組み合わせて初めて機能するという点は、自身の業務においても意識していきたい。</w:t>
-      </w:r>
-    </w:p>
-    <w:p>
-      <w:pPr>
-        <w:spacing w:after="200" w:line="360"/>
-        <w:ind w:firstLine="210"/>
-      </w:pPr>
-      <w:r>
-        <w:rPr>
-          <w:sz w:val="21"/>
-          <w:szCs w:val="21"/>
-        </w:rPr>
-        <w:t xml:space="preserve">また、事業運営の担当者は出向者としてではなく「当事者として対象先のメンバーと同じ釜の飯を食う」という話は、出向の立場にある自分にとって耳の痛いものだった。どこかで「いずれ戻る人間」という意識で仕事をしていないか、考えさせられた。</w:t>
-      </w:r>
-    </w:p>
-    <w:p>
-      <w:pPr>
-        <w:spacing w:after="200" w:line="360"/>
-        <w:ind w:firstLine="210"/>
-      </w:pPr>
-      <w:r>
-        <w:rPr>
-          <w:sz w:val="21"/>
-          <w:szCs w:val="21"/>
-        </w:rPr>
-        <w:t xml:space="preserve">投資実務の回では、業界の華やかなイメージとの落差が勉強になった。17か月で約1,000件の案件情報を検討し、LOIを提出したのは8件、DDまで進んだ案件はゼロという数字には驚いた。「千三つ」という言葉が誇張ではないことがよく分かった。「案件を取ってくるやつが一番偉い」、すなわちソーシングは本質的に営業であるという説明も、書籍等で語られるPE業界のイメージとは異なる、現場の実感がこもった話だと感じた。DDについても、株主の変遷が書類でも記憶でも辿れない、賃貸借契約のCOC条項によりディールが白紙になる、クロージング直前に売主の心変わりが起きる、といった具体例が豊富で、非上場の中小企業を対象とすることの難しさがよく理解できた。DDに1億円近くを投じた後であっても「これはやってはいけない」と判断して撤退できるかどうかというサンクコストの議論は、投資に限らずあらゆる業務に当てはまるものだと思う。</w:t>
-      </w:r>
-    </w:p>
-    <w:p>
-      <w:pPr>
-        <w:spacing w:after="200" w:line="360"/>
-        <w:ind w:firstLine="210"/>
-      </w:pPr>
-      <w:r>
-        <w:rPr>
-          <w:sz w:val="21"/>
-          <w:szCs w:val="21"/>
-        </w:rPr>
-        <w:t xml:space="preserve">スキームの説明では、売主再出資による2段階エグジットが勉強になった。12億円で売り切るよりも、10億円に下げてもらい1億円を再出資してもらう方が、レバレッジの効果により売主は20%の持分を確保でき、再エグジット時には手取りの合計が大きくなる可能性があるという説明は分かりやすかった。ただし、このスキームが成立するかどうかは、数年後の企業価値を売主に信じてもらえるかどうかにかかっており、最終的には投資ストーリーと人への信頼の問題に帰着するという点が印象に残った。駆け引きをせず、都合の悪いことも先に伝えるという「誠実さ」についての話も、自身の業務の参考にしたい。</w:t>
-      </w:r>
-    </w:p>
-    <w:p>
-      <w:pPr>
-        <w:spacing w:after="200" w:line="360"/>
-        <w:ind w:firstLine="210"/>
-      </w:pPr>
-      <w:r>
-        <w:rPr>
-          <w:sz w:val="21"/>
-          <w:szCs w:val="21"/>
-        </w:rPr>
-        <w:t xml:space="preserve">全体を通じて、PEの仕事を金融の技術としてではなく経営そのものとして説明された点に、本講義の意義があったと考える。ステークホルダー全員が幸せになることを本気で考えなければ投資は失敗するという話が、労務トラブルゼロ、投資元本を一度も割っていないという実績とともに語られていた点に説得力があった。出向者という中途半端になりがちな立場ではあるが、講義で学んだことを踏まえ、投資先に対して当事者意識を持って業務にあたりたい。</w:t>
+        <w:t xml:space="preserve">私は事業会社からPEファンドに出向している。出向先がハンズオン支援を看板に掲げるファンドということもあって、本講義は自分の業務との重なりが大きく、うなずかされる場面が多かった。ここでは特に印象に残った点をいくつか挙げたい。</w:t>
+      </w:r>
+    </w:p>
+    <w:p>
+      <w:pPr>
+        <w:spacing w:after="200" w:line="360"/>
+        <w:ind w:firstLine="210"/>
+      </w:pPr>
+      <w:r>
+        <w:rPr>
+          <w:sz w:val="21"/>
+          <w:szCs w:val="21"/>
+        </w:rPr>
+        <w:t xml:space="preserve">一つ目は、PEは金融と言いながら実は事業が本質だ、という指摘である。安く買い、レバレッジをかけ、高く売るという金融工学的な手法の効果は今日では限定的で、EBITDA、つまり本業の収益力を高めない限りリターンは出ない。この点自体は業務の中で感じていたことだが、ジャパンブルーの事例には考えさせられた。投資判断の決め手になったのが、デューデリジェンスの分析資料ではなく、縫製工場の75歳の工場長が「職人が執着すべきクオリティ」を語る映像だったという。財務諸表に表れない価値を見て完全なアンダーバリューだと確信した、という説明を聞きながら、数字の前にまず事業と人を見るという当たり前のことが自分は実際にできているだろうかと自問した。</w:t>
+      </w:r>
+    </w:p>
+    <w:p>
+      <w:pPr>
+        <w:spacing w:after="200" w:line="360"/>
+        <w:ind w:firstLine="210"/>
+      </w:pPr>
+      <w:r>
+        <w:rPr>
+          <w:sz w:val="21"/>
+          <w:szCs w:val="21"/>
+        </w:rPr>
+        <w:t xml:space="preserve">二つ目は、最も共感した点だが、エンゲージメントに関する議論である。エンゲージメントが低下するのは業績の良し悪しではなく、「従業員の声が経営層に届いていない」「自分たちが軽視されている」といった感覚に強く影響される。だから声を聞ける場を作り、経営に反映していくことが重要だ――この指摘は、出向先で日々感じていることそのものだった。投資先の従業員と話すと、不満の中身は待遇そのものではなく、知らされないまま物事が決まっていくことへの不満であるケースが多い。講師は投資直後の3か月で100人全員とワンオンワンを行い、その上で基本戦略を立てるという。手間を考えると簡単に真似できるものではないが、結局これが一番の近道なのだろう。ストックオプション等の制度は出向先でも使っている。ただ、制度だけでは人は動かない。一人ひとりとの対話と組み合わせて初めて機能するという整理には納得感があった。</w:t>
+      </w:r>
+    </w:p>
+    <w:p>
+      <w:pPr>
+        <w:spacing w:after="200" w:line="360"/>
+        <w:ind w:firstLine="210"/>
+      </w:pPr>
+      <w:r>
+        <w:rPr>
+          <w:sz w:val="21"/>
+          <w:szCs w:val="21"/>
+        </w:rPr>
+        <w:t xml:space="preserve">なお、事業運営の担当者は出向者としてではなく「当事者として対象先のメンバーと同じ釜の飯を食う」という話があった。出向の身としては耳が痛い。どこかで「いずれ戻る人間」という意識で仕事をしていないか、反省させられた。</w:t>
+      </w:r>
+    </w:p>
+    <w:p>
+      <w:pPr>
+        <w:spacing w:after="200" w:line="360"/>
+        <w:ind w:firstLine="210"/>
+      </w:pPr>
+      <w:r>
+        <w:rPr>
+          <w:sz w:val="21"/>
+          <w:szCs w:val="21"/>
+        </w:rPr>
+        <w:t xml:space="preserve">実務プロセスの回も面白かった。17か月で約1000件の案件情報を検討して、LOI提出が8件、DDまで進んだ案件はゼロ。「千三つ」は多少の誇張だろうと思っていたので、この数字には正直驚いた。案件を取ってくる人間が一番偉い、ソーシングは要するに営業だ、という説明にも、書籍で語られる華やかな業界イメージとは違う現場の実感がこもっていた。DDの具体例も豊富で、株主の変遷が書類でも記憶でも辿れない、賃貸借契約のCOC条項でディールが白紙になる、クロージング直前に売主の心変わりが起きる等、非上場の中小企業ならではの難しさがよく分かった。DDに1億円近くかけた後で「これはやってはいけない」と撤退できるかどうかというサンクコストの話は、投資に限らずどんな業務にも当てはまる論点だと思う。</w:t>
+      </w:r>
+    </w:p>
+    <w:p>
+      <w:pPr>
+        <w:spacing w:after="200" w:line="360"/>
+        <w:ind w:firstLine="210"/>
+      </w:pPr>
+      <w:r>
+        <w:rPr>
+          <w:sz w:val="21"/>
+          <w:szCs w:val="21"/>
+        </w:rPr>
+        <w:t xml:space="preserve">スキーム面では、売主再出資による2段階エグジットの説明が分かりやすかった。12億円で売り切るより、10億円に下げて1億円を再出資してもらう方が、レバレッジの効果で売主は20%の持分を確保でき、再エグジット時の手取り合計はむしろ大きくなり得る。ただしこれが成立するかどうかは、数年後の企業価値を売主に信じてもらえるか、つまり投資ストーリーと人への信頼にかかっている。駆け引きをせず都合の悪いことも先に伝えるという「誠実さ」の話も含めて、テクニックの話が最後は信頼の話に戻ってくるのが本講義の一貫した特徴だったように思う。</w:t>
+      </w:r>
+    </w:p>
+    <w:p>
+      <w:pPr>
+        <w:spacing w:after="200" w:line="360"/>
+        <w:ind w:firstLine="210"/>
+      </w:pPr>
+      <w:r>
+        <w:rPr>
+          <w:sz w:val="21"/>
+          <w:szCs w:val="21"/>
+        </w:rPr>
+        <w:t xml:space="preserve">全体として、PEの仕事を金融の技術ではなく経営そのものとして説明された点に本講義の意義があった。ステークホルダー全員が幸せになることを本気で考えなければ投資は失敗するという話が、労務トラブルゼロ、投資元本を一度も割っていないという実績とセットで語られるからこそ、説得力がある。出向者という中途半端になりがちな立場ではあるが、投資先に対して当事者意識を持って業務にあたりたいと改めて感じた次第である。</w:t>
       </w:r>
     </w:p>
     <w:sectPr>

</xml_diff>

<commit_message>
Add title and student header to report
Co-Authored-By: Claude Fable 5 <noreply@anthropic.com>
Claude-Session: https://claude.ai/code/session_01DpTFQMrCJE7j72XeUMnPZi
</commit_message>
<xml_diff>
--- a/reports/PE講義レポート.docx
+++ b/reports/PE講義レポート.docx
@@ -2,6 +2,19 @@
 <file path=word/document.xml><?xml version="1.0" encoding="utf-8"?>
 <w:document xmlns:wpc="http://schemas.microsoft.com/office/word/2010/wordprocessingCanvas" xmlns:mc="http://schemas.openxmlformats.org/markup-compatibility/2006" xmlns:o="urn:schemas-microsoft-com:office:office" xmlns:r="http://schemas.openxmlformats.org/officeDocument/2006/relationships" xmlns:m="http://schemas.openxmlformats.org/officeDocument/2006/math" xmlns:v="urn:schemas-microsoft-com:vml" xmlns:wp14="http://schemas.microsoft.com/office/word/2010/wordprocessingDrawing" xmlns:wp="http://schemas.openxmlformats.org/drawingml/2006/wordprocessingDrawing" xmlns:w10="urn:schemas-microsoft-com:office:word" xmlns:w="http://schemas.openxmlformats.org/wordprocessingml/2006/main" xmlns:w14="http://schemas.microsoft.com/office/word/2010/wordml" xmlns:w15="http://schemas.microsoft.com/office/word/2012/wordml" xmlns:wpg="http://schemas.microsoft.com/office/word/2010/wordprocessingGroup" xmlns:wpi="http://schemas.microsoft.com/office/word/2010/wordprocessingInk" xmlns:wne="http://schemas.microsoft.com/office/word/2006/wordml" xmlns:wps="http://schemas.microsoft.com/office/word/2010/wordprocessingShape" xmlns:cx="http://schemas.microsoft.com/office/drawing/2014/chartex" xmlns:cx1="http://schemas.microsoft.com/office/drawing/2015/9/8/chartex" xmlns:cx2="http://schemas.microsoft.com/office/drawing/2015/10/21/chartex" xmlns:cx3="http://schemas.microsoft.com/office/drawing/2016/5/9/chartex" xmlns:cx4="http://schemas.microsoft.com/office/drawing/2016/5/10/chartex" xmlns:cx5="http://schemas.microsoft.com/office/drawing/2016/5/11/chartex" xmlns:cx6="http://schemas.microsoft.com/office/drawing/2016/5/12/chartex" xmlns:cx7="http://schemas.microsoft.com/office/drawing/2016/5/13/chartex" xmlns:cx8="http://schemas.microsoft.com/office/drawing/2016/5/14/chartex" xmlns:aink="http://schemas.microsoft.com/office/drawing/2016/ink" xmlns:am3d="http://schemas.microsoft.com/office/drawing/2017/model3d" xmlns:w16cex="http://schemas.microsoft.com/office/word/2018/wordml/cex" xmlns:w16cid="http://schemas.microsoft.com/office/word/2016/wordml/cid" xmlns:w16="http://schemas.microsoft.com/office/word/2018/wordml" xmlns:w16sdtdh="http://schemas.microsoft.com/office/word/2020/wordml/sdtdatahash" xmlns:w16se="http://schemas.microsoft.com/office/word/2015/wordml/symex" mc:Ignorable="w14 w15 wp14">
   <w:body>
+    <w:p>
+      <w:pPr>
+        <w:spacing w:after="300"/>
+        <w:jc w:val="right"/>
+      </w:pPr>
+      <w:r>
+        <w:rPr>
+          <w:sz w:val="21"/>
+          <w:szCs w:val="21"/>
+        </w:rPr>
+        <w:t xml:space="preserve">学籍番号：BM25F037　氏名：松葉　大希</w:t>
+      </w:r>
+    </w:p>
     <w:p>
       <w:pPr>
         <w:spacing w:after="400"/>
@@ -14,7 +27,7 @@
           <w:sz w:val="28"/>
           <w:szCs w:val="28"/>
         </w:rPr>
-        <w:t xml:space="preserve">「プライベートエクイティファンドの実際」を受講して</w:t>
+        <w:t xml:space="preserve">課題: プライベートエクイティの実際</w:t>
       </w:r>
     </w:p>
     <w:p>

</xml_diff>